<commit_message>
Nouvelle version du kit usagers : design coloré + inscription via le contact MSP
</commit_message>
<xml_diff>
--- a/courrier-usagers.docx
+++ b/courrier-usagers.docx
@@ -261,7 +261,7 @@
           <w:color w:val="22602C"/>
         </w:rPr>
         <w:br/>
-        <w:t>Parlez-en à un professionnel de notre maison de santé ou contactez :</w:t>
+        <w:t>Pour vous inscrire, contactez notre référent :</w:t>
       </w:r>
       <w:r>
         <w:rPr>
@@ -282,7 +282,7 @@
     </w:p>
     <w:p>
       <w:r>
-        <w:t>Nous pourrons vous présenter le programme et échanger avec vous sur les modalités d’inscription et d’organisation de votre venue.</w:t>
+        <w:t>C’est notre équipe qui se charge de votre inscription (gratuite) : nous vous présenterons le programme et organiserons votre venue avec vous.</w:t>
       </w:r>
     </w:p>
     <w:p>

</xml_diff>